<commit_message>
docs: update all game architecture docs and remove legacy strand-bezem-escape references
</commit_message>
<xml_diff>
--- a/docs/UX_Design_Specification_Magisch_Strand_Avontuur.docx
+++ b/docs/UX_Design_Specification_Magisch_Strand_Avontuur.docx
@@ -27,9 +27,7 @@
           <w:color w:val="0B8457"/>
           <w:sz w:val="48"/>
         </w:rPr>
-        <w:t>Strand-bezem-escape</w:t>
-        <w:br/>
-        <w:t>"Magisch Strand Avontuur"</w:t>
+        <w:t>Magisch Strand Avontuur</w:t>
       </w:r>
     </w:p>
     <w:p>
@@ -109,7 +107,7 @@
               <w:rPr>
                 <w:sz w:val="19"/>
               </w:rPr>
-              <w:t>Strand-bezem-escape (Magisch Strand Avontuur)</w:t>
+              <w:t>Magisch Strand Avontuur</w:t>
             </w:r>
           </w:p>
         </w:tc>
@@ -336,7 +334,7 @@
         <w:spacing w:after="160" w:line="276" w:lineRule="auto"/>
       </w:pPr>
       <w:r>
-        <w:t>Dit document bevat het volledige en geharmoniseerde User Experience (UX) en User Interface (UI) ontwerpdocument voor alle 9 schermen en overlays van Strand-bezem-escape (Magisch Strand Avontuur). Met alle menu's, gameplay-omgevingen, instructiemodals, invoeroverlays en beloningsschermen vastgelegd in gestandaardiseerde tabellen, vormt dit de definitieve blauwdruk voor ontwikkeling en test-acceptatie.</w:t>
+        <w:t>Dit document bevat het volledige en geharmoniseerde User Experience (UX) en User Interface (UI) ontwerpdocument voor alle 9 schermen en overlays van Magisch Strand Avontuur. Met alle menu's, gameplay-omgevingen, instructiemodals, invoeroverlays en beloningsschermen vastgelegd in gestandaardiseerde tabellen, vormt dit de definitieve blauwdruk voor ontwikkeling en test-acceptatie.</w:t>
       </w:r>
     </w:p>
     <w:tbl>
@@ -378,7 +376,7 @@
                 <w:color w:val="0B8457"/>
                 <w:sz w:val="21"/>
               </w:rPr>
-              <w:t>📌 KERNPRINCIPES VAN STRAND-BEZEM-ESCAPE UX</w:t>
+              <w:t>📌 KERNPRINCIPES VAN MAGISCH STRAND AVONTUUR UX</w:t>
               <w:br/>
             </w:r>
           </w:p>
@@ -16510,7 +16508,7 @@
                 <w:color w:val="28323C"/>
                 <w:sz w:val="19"/>
               </w:rPr>
-              <w:t>✓ Alle 9 schermen en modals van Strand-bezem-escape zijn volledig gespecificeerd.</w:t>
+              <w:t>✓ Alle 9 schermen en modals van Magisch Strand Avontuur zijn volledig gespecificeerd.</w:t>
             </w:r>
           </w:p>
           <w:p>

</xml_diff>